<commit_message>
Add AI name cleaning feature
</commit_message>
<xml_diff>
--- a/certificate-maker/template/Certificates_Template.docx
+++ b/certificate-maker/template/Certificates_Template.docx
@@ -4,21 +4,16 @@
   <w:body>
     <w:p>
       <w:pPr>
-        <w:spacing w:before="46"/>
-        <w:ind w:left="427"/>
-        <w:rPr>
-          <w:sz w:val="30"/>
-        </w:rPr>
+        <w:pStyle w:val="BodyText"/>
       </w:pPr>
       <w:r>
         <w:rPr>
           <w:noProof/>
-          <w:sz w:val="30"/>
         </w:rPr>
         <mc:AlternateContent>
           <mc:Choice Requires="wps">
             <w:drawing>
-              <wp:anchor distT="0" distB="0" distL="114300" distR="114300" simplePos="0" relativeHeight="251659264" behindDoc="0" locked="0" layoutInCell="1" allowOverlap="1" wp14:anchorId="5FA397F8" wp14:editId="3E4705BE">
+              <wp:anchor distT="0" distB="0" distL="114300" distR="114300" simplePos="0" relativeHeight="251659264" behindDoc="0" locked="0" layoutInCell="1" allowOverlap="1" wp14:anchorId="5FA397F8" wp14:editId="0C0DCAB7">
                 <wp:simplePos x="0" y="0"/>
                 <wp:positionH relativeFrom="column">
                   <wp:posOffset>644525</wp:posOffset>
@@ -27,7 +22,7 @@
                   <wp:posOffset>3187700</wp:posOffset>
                 </wp:positionV>
                 <wp:extent cx="4191000" cy="600075"/>
-                <wp:effectExtent l="0" t="0" r="19050" b="28575"/>
+                <wp:effectExtent l="0" t="0" r="0" b="9525"/>
                 <wp:wrapNone/>
                 <wp:docPr id="1936416539" name="Text Box 13"/>
                 <wp:cNvGraphicFramePr/>
@@ -47,9 +42,7 @@
                           <a:schemeClr val="lt1"/>
                         </a:solidFill>
                         <a:ln w="6350">
-                          <a:solidFill>
-                            <a:prstClr val="black"/>
-                          </a:solidFill>
+                          <a:noFill/>
                         </a:ln>
                       </wps:spPr>
                       <wps:txbx>
@@ -90,7 +83,7 @@
                 <v:stroke joinstyle="miter"/>
                 <v:path gradientshapeok="t" o:connecttype="rect"/>
               </v:shapetype>
-              <v:shape id="Text Box 13" o:spid="_x0000_s1026" type="#_x0000_t202" style="position:absolute;left:0;text-align:left;margin-left:50.75pt;margin-top:251pt;width:330pt;height:47.25pt;z-index:251659264;visibility:visible;mso-wrap-style:square;mso-wrap-distance-left:9pt;mso-wrap-distance-top:0;mso-wrap-distance-right:9pt;mso-wrap-distance-bottom:0;mso-position-horizontal:absolute;mso-position-horizontal-relative:text;mso-position-vertical:absolute;mso-position-vertical-relative:text;v-text-anchor:top" o:gfxdata="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" fillcolor="white [3201]" strokeweight=".5pt">
+              <v:shape id="Text Box 13" o:spid="_x0000_s1026" type="#_x0000_t202" style="position:absolute;margin-left:50.75pt;margin-top:251pt;width:330pt;height:47.25pt;z-index:251659264;visibility:visible;mso-wrap-style:square;mso-wrap-distance-left:9pt;mso-wrap-distance-top:0;mso-wrap-distance-right:9pt;mso-wrap-distance-bottom:0;mso-position-horizontal:absolute;mso-position-horizontal-relative:text;mso-position-vertical:absolute;mso-position-vertical-relative:text;v-text-anchor:top" o:gfxdata="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" fillcolor="white [3201]" stroked="f" strokeweight=".5pt">
                 <v:textbox>
                   <w:txbxContent>
                     <w:p>
@@ -119,7 +112,6 @@
       <w:r>
         <w:rPr>
           <w:noProof/>
-          <w:sz w:val="30"/>
         </w:rPr>
         <w:drawing>
           <wp:anchor distT="0" distB="0" distL="114300" distR="114300" simplePos="0" relativeHeight="251658240" behindDoc="1" locked="0" layoutInCell="1" allowOverlap="1" wp14:anchorId="4FBA64CA" wp14:editId="0FE99266">

</xml_diff>

<commit_message>
Fix: resolve case-sensitivity, TS compiler, and routing conflicts
</commit_message>
<xml_diff>
--- a/certificate-maker/template/Certificates_Template.docx
+++ b/certificate-maker/template/Certificates_Template.docx
@@ -3,9 +3,6 @@
 <w:document xmlns:wpc="http://schemas.microsoft.com/office/word/2010/wordprocessingCanvas" xmlns:cx="http://schemas.microsoft.com/office/drawing/2014/chartex" xmlns:cx1="http://schemas.microsoft.com/office/drawing/2015/9/8/chartex" xmlns:cx2="http://schemas.microsoft.com/office/drawing/2015/10/21/chartex" xmlns:cx3="http://schemas.microsoft.com/office/drawing/2016/5/9/chartex" xmlns:cx4="http://schemas.microsoft.com/office/drawing/2016/5/10/chartex" xmlns:cx5="http://schemas.microsoft.com/office/drawing/2016/5/11/chartex" xmlns:cx6="http://schemas.microsoft.com/office/drawing/2016/5/12/chartex" xmlns:cx7="http://schemas.microsoft.com/office/drawing/2016/5/13/chartex" xmlns:cx8="http://schemas.microsoft.com/office/drawing/2016/5/14/chartex" xmlns:mc="http://schemas.openxmlformats.org/markup-compatibility/2006" xmlns:aink="http://schemas.microsoft.com/office/drawing/2016/ink" xmlns:am3d="http://schemas.microsoft.com/office/drawing/2017/model3d" xmlns:o="urn:schemas-microsoft-com:office:office" xmlns:oel="http://schemas.microsoft.com/office/2019/extlst" xmlns:r="http://schemas.openxmlformats.org/officeDocument/2006/relationships" xmlns:m="http://schemas.openxmlformats.org/officeDocument/2006/math" xmlns:v="urn:schemas-microsoft-com:vml" xmlns:wp14="http://schemas.microsoft.com/office/word/2010/wordprocessingDrawing" xmlns:wp="http://schemas.openxmlformats.org/drawingml/2006/wordprocessingDrawing" xmlns:w10="urn:schemas-microsoft-com:office:word" xmlns:w="http://schemas.openxmlformats.org/wordprocessingml/2006/main" xmlns:w14="http://schemas.microsoft.com/office/word/2010/wordml" xmlns:w15="http://schemas.microsoft.com/office/word/2012/wordml" xmlns:w16cex="http://schemas.microsoft.com/office/word/2018/wordml/cex" xmlns:w16cid="http://schemas.microsoft.com/office/word/2016/wordml/cid" xmlns:w16="http://schemas.microsoft.com/office/word/2018/wordml" xmlns:w16du="http://schemas.microsoft.com/office/word/2023/wordml/word16du" xmlns:w16sdtdh="http://schemas.microsoft.com/office/word/2020/wordml/sdtdatahash" xmlns:w16sdtfl="http://schemas.microsoft.com/office/word/2024/wordml/sdtformatlock" xmlns:w16se="http://schemas.microsoft.com/office/word/2015/wordml/symex" xmlns:wpg="http://schemas.microsoft.com/office/word/2010/wordprocessingGroup" xmlns:wpi="http://schemas.microsoft.com/office/word/2010/wordprocessingInk" xmlns:wne="http://schemas.microsoft.com/office/word/2006/wordml" xmlns:wps="http://schemas.microsoft.com/office/word/2010/wordprocessingShape" mc:Ignorable="w14 w15 w16se w16cid w16 w16cex w16sdtdh w16sdtfl w16du wp14">
   <w:body>
     <w:p>
-      <w:pPr>
-        <w:pStyle w:val="BodyText"/>
-      </w:pPr>
       <w:r>
         <w:rPr>
           <w:noProof/>
@@ -13,18 +10,18 @@
         <mc:AlternateContent>
           <mc:Choice Requires="wps">
             <w:drawing>
-              <wp:anchor distT="0" distB="0" distL="114300" distR="114300" simplePos="0" relativeHeight="251659264" behindDoc="0" locked="0" layoutInCell="1" allowOverlap="1" wp14:anchorId="5FA397F8" wp14:editId="0C0DCAB7">
+              <wp:anchor distT="0" distB="0" distL="114300" distR="114300" simplePos="0" relativeHeight="251659264" behindDoc="0" locked="0" layoutInCell="1" allowOverlap="1" wp14:anchorId="1A7018E0" wp14:editId="61C45A7B">
                 <wp:simplePos x="0" y="0"/>
                 <wp:positionH relativeFrom="column">
-                  <wp:posOffset>644525</wp:posOffset>
+                  <wp:posOffset>2828925</wp:posOffset>
                 </wp:positionH>
                 <wp:positionV relativeFrom="paragraph">
-                  <wp:posOffset>3187700</wp:posOffset>
+                  <wp:posOffset>2552700</wp:posOffset>
                 </wp:positionV>
-                <wp:extent cx="4191000" cy="600075"/>
-                <wp:effectExtent l="0" t="0" r="0" b="9525"/>
+                <wp:extent cx="3724275" cy="752475"/>
+                <wp:effectExtent l="0" t="0" r="0" b="0"/>
                 <wp:wrapNone/>
-                <wp:docPr id="1936416539" name="Text Box 13"/>
+                <wp:docPr id="234208973" name="Text Box 4"/>
                 <wp:cNvGraphicFramePr/>
                 <a:graphic xmlns:a="http://schemas.openxmlformats.org/drawingml/2006/main">
                   <a:graphicData uri="http://schemas.microsoft.com/office/word/2010/wordprocessingShape">
@@ -33,14 +30,12 @@
                       <wps:spPr>
                         <a:xfrm>
                           <a:off x="0" y="0"/>
-                          <a:ext cx="4191000" cy="600075"/>
+                          <a:ext cx="3724275" cy="752475"/>
                         </a:xfrm>
                         <a:prstGeom prst="rect">
                           <a:avLst/>
                         </a:prstGeom>
-                        <a:solidFill>
-                          <a:schemeClr val="lt1"/>
-                        </a:solidFill>
+                        <a:noFill/>
                         <a:ln w="6350">
                           <a:noFill/>
                         </a:ln>
@@ -51,13 +46,13 @@
                             <w:pPr>
                               <w:jc w:val="center"/>
                               <w:rPr>
-                                <w:sz w:val="72"/>
-                                <w:szCs w:val="72"/>
+                                <w:sz w:val="44"/>
+                                <w:szCs w:val="40"/>
                               </w:rPr>
                             </w:pPr>
                             <w:r>
                               <w:rPr>
-                                <w:sz w:val="40"/>
+                                <w:sz w:val="44"/>
                                 <w:szCs w:val="40"/>
                               </w:rPr>
                               <w:t>{name}</w:t>
@@ -79,24 +74,24 @@
           </mc:Choice>
           <mc:Fallback>
             <w:pict>
-              <v:shapetype w14:anchorId="5FA397F8" id="_x0000_t202" coordsize="21600,21600" o:spt="202" path="m,l,21600r21600,l21600,xe">
+              <v:shapetype w14:anchorId="1A7018E0" id="_x0000_t202" coordsize="21600,21600" o:spt="202" path="m,l,21600r21600,l21600,xe">
                 <v:stroke joinstyle="miter"/>
                 <v:path gradientshapeok="t" o:connecttype="rect"/>
               </v:shapetype>
-              <v:shape id="Text Box 13" o:spid="_x0000_s1026" type="#_x0000_t202" style="position:absolute;margin-left:50.75pt;margin-top:251pt;width:330pt;height:47.25pt;z-index:251659264;visibility:visible;mso-wrap-style:square;mso-wrap-distance-left:9pt;mso-wrap-distance-top:0;mso-wrap-distance-right:9pt;mso-wrap-distance-bottom:0;mso-position-horizontal:absolute;mso-position-horizontal-relative:text;mso-position-vertical:absolute;mso-position-vertical-relative:text;v-text-anchor:top" o:gfxdata="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" fillcolor="white [3201]" stroked="f" strokeweight=".5pt">
+              <v:shape id="Text Box 4" o:spid="_x0000_s1026" type="#_x0000_t202" style="position:absolute;margin-left:222.75pt;margin-top:201pt;width:293.25pt;height:59.25pt;z-index:251659264;visibility:visible;mso-wrap-style:square;mso-wrap-distance-left:9pt;mso-wrap-distance-top:0;mso-wrap-distance-right:9pt;mso-wrap-distance-bottom:0;mso-position-horizontal:absolute;mso-position-horizontal-relative:text;mso-position-vertical:absolute;mso-position-vertical-relative:text;v-text-anchor:top" o:gfxdata="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" filled="f" stroked="f" strokeweight=".5pt">
                 <v:textbox>
                   <w:txbxContent>
                     <w:p>
                       <w:pPr>
                         <w:jc w:val="center"/>
                         <w:rPr>
-                          <w:sz w:val="72"/>
-                          <w:szCs w:val="72"/>
+                          <w:sz w:val="44"/>
+                          <w:szCs w:val="40"/>
                         </w:rPr>
                       </w:pPr>
                       <w:r>
                         <w:rPr>
-                          <w:sz w:val="40"/>
+                          <w:sz w:val="44"/>
                           <w:szCs w:val="40"/>
                         </w:rPr>
                         <w:t>{name}</w:t>
@@ -114,18 +109,10 @@
           <w:noProof/>
         </w:rPr>
         <w:drawing>
-          <wp:anchor distT="0" distB="0" distL="114300" distR="114300" simplePos="0" relativeHeight="251658240" behindDoc="1" locked="0" layoutInCell="1" allowOverlap="1" wp14:anchorId="4FBA64CA" wp14:editId="0FE99266">
-            <wp:simplePos x="0" y="0"/>
-            <wp:positionH relativeFrom="column">
-              <wp:posOffset>-1079500</wp:posOffset>
-            </wp:positionH>
-            <wp:positionV relativeFrom="paragraph">
-              <wp:posOffset>-1231265</wp:posOffset>
-            </wp:positionV>
-            <wp:extent cx="7530858" cy="10686244"/>
-            <wp:effectExtent l="0" t="0" r="0" b="1270"/>
-            <wp:wrapNone/>
-            <wp:docPr id="1652190946" name="Picture 12"/>
+          <wp:inline distT="0" distB="0" distL="0" distR="0" wp14:anchorId="65BF2164" wp14:editId="61FDE70C">
+            <wp:extent cx="8988180" cy="6353175"/>
+            <wp:effectExtent l="0" t="0" r="3810" b="0"/>
+            <wp:docPr id="1639348624" name="Picture 3"/>
             <wp:cNvGraphicFramePr>
               <a:graphicFrameLocks xmlns:a="http://schemas.openxmlformats.org/drawingml/2006/main" noChangeAspect="1"/>
             </wp:cNvGraphicFramePr>
@@ -154,7 +141,7 @@
                   <pic:spPr bwMode="auto">
                     <a:xfrm>
                       <a:off x="0" y="0"/>
-                      <a:ext cx="7530858" cy="10686244"/>
+                      <a:ext cx="8989688" cy="6354241"/>
                     </a:xfrm>
                     <a:prstGeom prst="rect">
                       <a:avLst/>
@@ -167,24 +154,15 @@
                 </pic:pic>
               </a:graphicData>
             </a:graphic>
-            <wp14:sizeRelH relativeFrom="margin">
-              <wp14:pctWidth>0</wp14:pctWidth>
-            </wp14:sizeRelH>
-            <wp14:sizeRelV relativeFrom="margin">
-              <wp14:pctHeight>0</wp14:pctHeight>
-            </wp14:sizeRelV>
-          </wp:anchor>
+          </wp:inline>
         </w:drawing>
       </w:r>
     </w:p>
     <w:sectPr>
-      <w:type w:val="continuous"/>
-      <w:pgSz w:w="11910" w:h="16850"/>
-      <w:pgMar w:top="1940" w:right="1700" w:bottom="280" w:left="1700" w:header="720" w:footer="720" w:gutter="0"/>
-      <w:cols w:num="2" w:space="720" w:equalWidth="0">
-        <w:col w:w="2694" w:space="3095"/>
-        <w:col w:w="2721"/>
-      </w:cols>
+      <w:pgSz w:w="15840" w:h="12240" w:orient="landscape"/>
+      <w:pgMar w:top="1440" w:right="1440" w:bottom="1440" w:left="1440" w:header="720" w:footer="720" w:gutter="0"/>
+      <w:cols w:space="720"/>
+      <w:docGrid w:linePitch="360"/>
     </w:sectPr>
   </w:body>
 </w:document>
@@ -197,15 +175,12 @@
       <w:rPr>
         <w:rFonts w:asciiTheme="minorHAnsi" w:eastAsiaTheme="minorHAnsi" w:hAnsiTheme="minorHAnsi" w:cstheme="minorBidi"/>
         <w:sz w:val="22"/>
-        <w:szCs w:val="22"/>
-        <w:lang w:val="en-US" w:eastAsia="en-US" w:bidi="ar-SA"/>
+        <w:lang w:val="en-US" w:eastAsia="en-US" w:bidi="hi-IN"/>
       </w:rPr>
     </w:rPrDefault>
     <w:pPrDefault>
       <w:pPr>
-        <w:widowControl w:val="0"/>
-        <w:autoSpaceDE w:val="0"/>
-        <w:autoSpaceDN w:val="0"/>
+        <w:spacing w:after="160" w:line="259" w:lineRule="auto"/>
       </w:pPr>
     </w:pPrDefault>
   </w:docDefaults>
@@ -591,40 +566,206 @@
     <w:name w:val="Normal"/>
     <w:qFormat/>
     <w:rPr>
-      <w:rFonts w:ascii="Times New Roman" w:eastAsia="Times New Roman" w:hAnsi="Times New Roman" w:cs="Times New Roman"/>
+      <w:rFonts w:cs="Mangal"/>
     </w:rPr>
   </w:style>
   <w:style w:type="paragraph" w:styleId="Heading1">
     <w:name w:val="heading 1"/>
     <w:basedOn w:val="Normal"/>
-    <w:uiPriority w:val="9"/>
-    <w:qFormat/>
+    <w:next w:val="Normal"/>
+    <w:link w:val="Heading1Char"/>
+    <w:uiPriority w:val="9"/>
+    <w:qFormat/>
+    <w:rsid w:val="00AC07C7"/>
     <w:pPr>
-      <w:ind w:left="11"/>
-      <w:jc w:val="center"/>
+      <w:keepNext/>
+      <w:keepLines/>
+      <w:spacing w:before="360" w:after="80"/>
       <w:outlineLvl w:val="0"/>
     </w:pPr>
     <w:rPr>
-      <w:b/>
-      <w:bCs/>
-      <w:sz w:val="105"/>
-      <w:szCs w:val="105"/>
+      <w:rFonts w:asciiTheme="majorHAnsi" w:eastAsiaTheme="majorEastAsia" w:hAnsiTheme="majorHAnsi" w:cstheme="majorBidi"/>
+      <w:color w:val="2F5496" w:themeColor="accent1" w:themeShade="BF"/>
+      <w:sz w:val="40"/>
+      <w:szCs w:val="36"/>
     </w:rPr>
   </w:style>
   <w:style w:type="paragraph" w:styleId="Heading2">
     <w:name w:val="heading 2"/>
     <w:basedOn w:val="Normal"/>
-    <w:uiPriority w:val="9"/>
+    <w:next w:val="Normal"/>
+    <w:link w:val="Heading2Char"/>
+    <w:uiPriority w:val="9"/>
+    <w:semiHidden/>
     <w:unhideWhenUsed/>
     <w:qFormat/>
+    <w:rsid w:val="00AC07C7"/>
     <w:pPr>
-      <w:spacing w:before="68"/>
-      <w:ind w:left="387"/>
+      <w:keepNext/>
+      <w:keepLines/>
+      <w:spacing w:before="160" w:after="80"/>
       <w:outlineLvl w:val="1"/>
     </w:pPr>
     <w:rPr>
-      <w:sz w:val="38"/>
-      <w:szCs w:val="38"/>
+      <w:rFonts w:asciiTheme="majorHAnsi" w:eastAsiaTheme="majorEastAsia" w:hAnsiTheme="majorHAnsi" w:cstheme="majorBidi"/>
+      <w:color w:val="2F5496" w:themeColor="accent1" w:themeShade="BF"/>
+      <w:sz w:val="32"/>
+      <w:szCs w:val="29"/>
+    </w:rPr>
+  </w:style>
+  <w:style w:type="paragraph" w:styleId="Heading3">
+    <w:name w:val="heading 3"/>
+    <w:basedOn w:val="Normal"/>
+    <w:next w:val="Normal"/>
+    <w:link w:val="Heading3Char"/>
+    <w:uiPriority w:val="9"/>
+    <w:semiHidden/>
+    <w:unhideWhenUsed/>
+    <w:qFormat/>
+    <w:rsid w:val="00AC07C7"/>
+    <w:pPr>
+      <w:keepNext/>
+      <w:keepLines/>
+      <w:spacing w:before="160" w:after="80"/>
+      <w:outlineLvl w:val="2"/>
+    </w:pPr>
+    <w:rPr>
+      <w:rFonts w:eastAsiaTheme="majorEastAsia" w:cstheme="majorBidi"/>
+      <w:color w:val="2F5496" w:themeColor="accent1" w:themeShade="BF"/>
+      <w:sz w:val="28"/>
+      <w:szCs w:val="25"/>
+    </w:rPr>
+  </w:style>
+  <w:style w:type="paragraph" w:styleId="Heading4">
+    <w:name w:val="heading 4"/>
+    <w:basedOn w:val="Normal"/>
+    <w:next w:val="Normal"/>
+    <w:link w:val="Heading4Char"/>
+    <w:uiPriority w:val="9"/>
+    <w:semiHidden/>
+    <w:unhideWhenUsed/>
+    <w:qFormat/>
+    <w:rsid w:val="00AC07C7"/>
+    <w:pPr>
+      <w:keepNext/>
+      <w:keepLines/>
+      <w:spacing w:before="80" w:after="40"/>
+      <w:outlineLvl w:val="3"/>
+    </w:pPr>
+    <w:rPr>
+      <w:rFonts w:eastAsiaTheme="majorEastAsia" w:cstheme="majorBidi"/>
+      <w:i/>
+      <w:iCs/>
+      <w:color w:val="2F5496" w:themeColor="accent1" w:themeShade="BF"/>
+    </w:rPr>
+  </w:style>
+  <w:style w:type="paragraph" w:styleId="Heading5">
+    <w:name w:val="heading 5"/>
+    <w:basedOn w:val="Normal"/>
+    <w:next w:val="Normal"/>
+    <w:link w:val="Heading5Char"/>
+    <w:uiPriority w:val="9"/>
+    <w:semiHidden/>
+    <w:unhideWhenUsed/>
+    <w:qFormat/>
+    <w:rsid w:val="00AC07C7"/>
+    <w:pPr>
+      <w:keepNext/>
+      <w:keepLines/>
+      <w:spacing w:before="80" w:after="40"/>
+      <w:outlineLvl w:val="4"/>
+    </w:pPr>
+    <w:rPr>
+      <w:rFonts w:eastAsiaTheme="majorEastAsia" w:cstheme="majorBidi"/>
+      <w:color w:val="2F5496" w:themeColor="accent1" w:themeShade="BF"/>
+    </w:rPr>
+  </w:style>
+  <w:style w:type="paragraph" w:styleId="Heading6">
+    <w:name w:val="heading 6"/>
+    <w:basedOn w:val="Normal"/>
+    <w:next w:val="Normal"/>
+    <w:link w:val="Heading6Char"/>
+    <w:uiPriority w:val="9"/>
+    <w:semiHidden/>
+    <w:unhideWhenUsed/>
+    <w:qFormat/>
+    <w:rsid w:val="00AC07C7"/>
+    <w:pPr>
+      <w:keepNext/>
+      <w:keepLines/>
+      <w:spacing w:before="40" w:after="0"/>
+      <w:outlineLvl w:val="5"/>
+    </w:pPr>
+    <w:rPr>
+      <w:rFonts w:eastAsiaTheme="majorEastAsia" w:cstheme="majorBidi"/>
+      <w:i/>
+      <w:iCs/>
+      <w:color w:val="595959" w:themeColor="text1" w:themeTint="A6"/>
+    </w:rPr>
+  </w:style>
+  <w:style w:type="paragraph" w:styleId="Heading7">
+    <w:name w:val="heading 7"/>
+    <w:basedOn w:val="Normal"/>
+    <w:next w:val="Normal"/>
+    <w:link w:val="Heading7Char"/>
+    <w:uiPriority w:val="9"/>
+    <w:semiHidden/>
+    <w:unhideWhenUsed/>
+    <w:qFormat/>
+    <w:rsid w:val="00AC07C7"/>
+    <w:pPr>
+      <w:keepNext/>
+      <w:keepLines/>
+      <w:spacing w:before="40" w:after="0"/>
+      <w:outlineLvl w:val="6"/>
+    </w:pPr>
+    <w:rPr>
+      <w:rFonts w:eastAsiaTheme="majorEastAsia" w:cstheme="majorBidi"/>
+      <w:color w:val="595959" w:themeColor="text1" w:themeTint="A6"/>
+    </w:rPr>
+  </w:style>
+  <w:style w:type="paragraph" w:styleId="Heading8">
+    <w:name w:val="heading 8"/>
+    <w:basedOn w:val="Normal"/>
+    <w:next w:val="Normal"/>
+    <w:link w:val="Heading8Char"/>
+    <w:uiPriority w:val="9"/>
+    <w:semiHidden/>
+    <w:unhideWhenUsed/>
+    <w:qFormat/>
+    <w:rsid w:val="00AC07C7"/>
+    <w:pPr>
+      <w:keepNext/>
+      <w:keepLines/>
+      <w:spacing w:after="0"/>
+      <w:outlineLvl w:val="7"/>
+    </w:pPr>
+    <w:rPr>
+      <w:rFonts w:eastAsiaTheme="majorEastAsia" w:cstheme="majorBidi"/>
+      <w:i/>
+      <w:iCs/>
+      <w:color w:val="272727" w:themeColor="text1" w:themeTint="D8"/>
+    </w:rPr>
+  </w:style>
+  <w:style w:type="paragraph" w:styleId="Heading9">
+    <w:name w:val="heading 9"/>
+    <w:basedOn w:val="Normal"/>
+    <w:next w:val="Normal"/>
+    <w:link w:val="Heading9Char"/>
+    <w:uiPriority w:val="9"/>
+    <w:semiHidden/>
+    <w:unhideWhenUsed/>
+    <w:qFormat/>
+    <w:rsid w:val="00AC07C7"/>
+    <w:pPr>
+      <w:keepNext/>
+      <w:keepLines/>
+      <w:spacing w:after="0"/>
+      <w:outlineLvl w:val="8"/>
+    </w:pPr>
+    <w:rPr>
+      <w:rFonts w:eastAsiaTheme="majorEastAsia" w:cstheme="majorBidi"/>
+      <w:color w:val="272727" w:themeColor="text1" w:themeTint="D8"/>
     </w:rPr>
   </w:style>
   <w:style w:type="character" w:default="1" w:styleId="DefaultParagraphFont">
@@ -654,27 +795,297 @@
     <w:semiHidden/>
     <w:unhideWhenUsed/>
   </w:style>
-  <w:style w:type="paragraph" w:styleId="BodyText">
-    <w:name w:val="Body Text"/>
+  <w:style w:type="character" w:customStyle="1" w:styleId="Heading1Char">
+    <w:name w:val="Heading 1 Char"/>
+    <w:basedOn w:val="DefaultParagraphFont"/>
+    <w:link w:val="Heading1"/>
+    <w:uiPriority w:val="9"/>
+    <w:rsid w:val="00AC07C7"/>
+    <w:rPr>
+      <w:rFonts w:asciiTheme="majorHAnsi" w:eastAsiaTheme="majorEastAsia" w:hAnsiTheme="majorHAnsi" w:cstheme="majorBidi"/>
+      <w:color w:val="2F5496" w:themeColor="accent1" w:themeShade="BF"/>
+      <w:sz w:val="40"/>
+      <w:szCs w:val="36"/>
+    </w:rPr>
+  </w:style>
+  <w:style w:type="character" w:customStyle="1" w:styleId="Heading2Char">
+    <w:name w:val="Heading 2 Char"/>
+    <w:basedOn w:val="DefaultParagraphFont"/>
+    <w:link w:val="Heading2"/>
+    <w:uiPriority w:val="9"/>
+    <w:semiHidden/>
+    <w:rsid w:val="00AC07C7"/>
+    <w:rPr>
+      <w:rFonts w:asciiTheme="majorHAnsi" w:eastAsiaTheme="majorEastAsia" w:hAnsiTheme="majorHAnsi" w:cstheme="majorBidi"/>
+      <w:color w:val="2F5496" w:themeColor="accent1" w:themeShade="BF"/>
+      <w:sz w:val="32"/>
+      <w:szCs w:val="29"/>
+    </w:rPr>
+  </w:style>
+  <w:style w:type="character" w:customStyle="1" w:styleId="Heading3Char">
+    <w:name w:val="Heading 3 Char"/>
+    <w:basedOn w:val="DefaultParagraphFont"/>
+    <w:link w:val="Heading3"/>
+    <w:uiPriority w:val="9"/>
+    <w:semiHidden/>
+    <w:rsid w:val="00AC07C7"/>
+    <w:rPr>
+      <w:rFonts w:eastAsiaTheme="majorEastAsia" w:cstheme="majorBidi"/>
+      <w:color w:val="2F5496" w:themeColor="accent1" w:themeShade="BF"/>
+      <w:sz w:val="28"/>
+      <w:szCs w:val="25"/>
+    </w:rPr>
+  </w:style>
+  <w:style w:type="character" w:customStyle="1" w:styleId="Heading4Char">
+    <w:name w:val="Heading 4 Char"/>
+    <w:basedOn w:val="DefaultParagraphFont"/>
+    <w:link w:val="Heading4"/>
+    <w:uiPriority w:val="9"/>
+    <w:semiHidden/>
+    <w:rsid w:val="00AC07C7"/>
+    <w:rPr>
+      <w:rFonts w:eastAsiaTheme="majorEastAsia" w:cstheme="majorBidi"/>
+      <w:i/>
+      <w:iCs/>
+      <w:color w:val="2F5496" w:themeColor="accent1" w:themeShade="BF"/>
+    </w:rPr>
+  </w:style>
+  <w:style w:type="character" w:customStyle="1" w:styleId="Heading5Char">
+    <w:name w:val="Heading 5 Char"/>
+    <w:basedOn w:val="DefaultParagraphFont"/>
+    <w:link w:val="Heading5"/>
+    <w:uiPriority w:val="9"/>
+    <w:semiHidden/>
+    <w:rsid w:val="00AC07C7"/>
+    <w:rPr>
+      <w:rFonts w:eastAsiaTheme="majorEastAsia" w:cstheme="majorBidi"/>
+      <w:color w:val="2F5496" w:themeColor="accent1" w:themeShade="BF"/>
+    </w:rPr>
+  </w:style>
+  <w:style w:type="character" w:customStyle="1" w:styleId="Heading6Char">
+    <w:name w:val="Heading 6 Char"/>
+    <w:basedOn w:val="DefaultParagraphFont"/>
+    <w:link w:val="Heading6"/>
+    <w:uiPriority w:val="9"/>
+    <w:semiHidden/>
+    <w:rsid w:val="00AC07C7"/>
+    <w:rPr>
+      <w:rFonts w:eastAsiaTheme="majorEastAsia" w:cstheme="majorBidi"/>
+      <w:i/>
+      <w:iCs/>
+      <w:color w:val="595959" w:themeColor="text1" w:themeTint="A6"/>
+    </w:rPr>
+  </w:style>
+  <w:style w:type="character" w:customStyle="1" w:styleId="Heading7Char">
+    <w:name w:val="Heading 7 Char"/>
+    <w:basedOn w:val="DefaultParagraphFont"/>
+    <w:link w:val="Heading7"/>
+    <w:uiPriority w:val="9"/>
+    <w:semiHidden/>
+    <w:rsid w:val="00AC07C7"/>
+    <w:rPr>
+      <w:rFonts w:eastAsiaTheme="majorEastAsia" w:cstheme="majorBidi"/>
+      <w:color w:val="595959" w:themeColor="text1" w:themeTint="A6"/>
+    </w:rPr>
+  </w:style>
+  <w:style w:type="character" w:customStyle="1" w:styleId="Heading8Char">
+    <w:name w:val="Heading 8 Char"/>
+    <w:basedOn w:val="DefaultParagraphFont"/>
+    <w:link w:val="Heading8"/>
+    <w:uiPriority w:val="9"/>
+    <w:semiHidden/>
+    <w:rsid w:val="00AC07C7"/>
+    <w:rPr>
+      <w:rFonts w:eastAsiaTheme="majorEastAsia" w:cstheme="majorBidi"/>
+      <w:i/>
+      <w:iCs/>
+      <w:color w:val="272727" w:themeColor="text1" w:themeTint="D8"/>
+    </w:rPr>
+  </w:style>
+  <w:style w:type="character" w:customStyle="1" w:styleId="Heading9Char">
+    <w:name w:val="Heading 9 Char"/>
+    <w:basedOn w:val="DefaultParagraphFont"/>
+    <w:link w:val="Heading9"/>
+    <w:uiPriority w:val="9"/>
+    <w:semiHidden/>
+    <w:rsid w:val="00AC07C7"/>
+    <w:rPr>
+      <w:rFonts w:eastAsiaTheme="majorEastAsia" w:cstheme="majorBidi"/>
+      <w:color w:val="272727" w:themeColor="text1" w:themeTint="D8"/>
+    </w:rPr>
+  </w:style>
+  <w:style w:type="paragraph" w:styleId="Title">
+    <w:name w:val="Title"/>
     <w:basedOn w:val="Normal"/>
-    <w:uiPriority w:val="1"/>
-    <w:qFormat/>
-    <w:rPr>
+    <w:next w:val="Normal"/>
+    <w:link w:val="TitleChar"/>
+    <w:uiPriority w:val="10"/>
+    <w:qFormat/>
+    <w:rsid w:val="00AC07C7"/>
+    <w:pPr>
+      <w:spacing w:after="80" w:line="240" w:lineRule="auto"/>
+      <w:contextualSpacing/>
+    </w:pPr>
+    <w:rPr>
+      <w:rFonts w:asciiTheme="majorHAnsi" w:eastAsiaTheme="majorEastAsia" w:hAnsiTheme="majorHAnsi" w:cstheme="majorBidi"/>
+      <w:spacing w:val="-10"/>
+      <w:kern w:val="28"/>
+      <w:sz w:val="56"/>
+      <w:szCs w:val="50"/>
+    </w:rPr>
+  </w:style>
+  <w:style w:type="character" w:customStyle="1" w:styleId="TitleChar">
+    <w:name w:val="Title Char"/>
+    <w:basedOn w:val="DefaultParagraphFont"/>
+    <w:link w:val="Title"/>
+    <w:uiPriority w:val="10"/>
+    <w:rsid w:val="00AC07C7"/>
+    <w:rPr>
+      <w:rFonts w:asciiTheme="majorHAnsi" w:eastAsiaTheme="majorEastAsia" w:hAnsiTheme="majorHAnsi" w:cstheme="majorBidi"/>
+      <w:spacing w:val="-10"/>
+      <w:kern w:val="28"/>
+      <w:sz w:val="56"/>
+      <w:szCs w:val="50"/>
+    </w:rPr>
+  </w:style>
+  <w:style w:type="paragraph" w:styleId="Subtitle">
+    <w:name w:val="Subtitle"/>
+    <w:basedOn w:val="Normal"/>
+    <w:next w:val="Normal"/>
+    <w:link w:val="SubtitleChar"/>
+    <w:uiPriority w:val="11"/>
+    <w:qFormat/>
+    <w:rsid w:val="00AC07C7"/>
+    <w:pPr>
+      <w:numPr>
+        <w:ilvl w:val="1"/>
+      </w:numPr>
+    </w:pPr>
+    <w:rPr>
+      <w:rFonts w:eastAsiaTheme="majorEastAsia" w:cstheme="majorBidi"/>
+      <w:color w:val="595959" w:themeColor="text1" w:themeTint="A6"/>
+      <w:spacing w:val="15"/>
       <w:sz w:val="28"/>
-      <w:szCs w:val="28"/>
+      <w:szCs w:val="25"/>
+    </w:rPr>
+  </w:style>
+  <w:style w:type="character" w:customStyle="1" w:styleId="SubtitleChar">
+    <w:name w:val="Subtitle Char"/>
+    <w:basedOn w:val="DefaultParagraphFont"/>
+    <w:link w:val="Subtitle"/>
+    <w:uiPriority w:val="11"/>
+    <w:rsid w:val="00AC07C7"/>
+    <w:rPr>
+      <w:rFonts w:eastAsiaTheme="majorEastAsia" w:cstheme="majorBidi"/>
+      <w:color w:val="595959" w:themeColor="text1" w:themeTint="A6"/>
+      <w:spacing w:val="15"/>
+      <w:sz w:val="28"/>
+      <w:szCs w:val="25"/>
+    </w:rPr>
+  </w:style>
+  <w:style w:type="paragraph" w:styleId="Quote">
+    <w:name w:val="Quote"/>
+    <w:basedOn w:val="Normal"/>
+    <w:next w:val="Normal"/>
+    <w:link w:val="QuoteChar"/>
+    <w:uiPriority w:val="29"/>
+    <w:qFormat/>
+    <w:rsid w:val="00AC07C7"/>
+    <w:pPr>
+      <w:spacing w:before="160"/>
+      <w:jc w:val="center"/>
+    </w:pPr>
+    <w:rPr>
+      <w:i/>
+      <w:iCs/>
+      <w:color w:val="404040" w:themeColor="text1" w:themeTint="BF"/>
+    </w:rPr>
+  </w:style>
+  <w:style w:type="character" w:customStyle="1" w:styleId="QuoteChar">
+    <w:name w:val="Quote Char"/>
+    <w:basedOn w:val="DefaultParagraphFont"/>
+    <w:link w:val="Quote"/>
+    <w:uiPriority w:val="29"/>
+    <w:rsid w:val="00AC07C7"/>
+    <w:rPr>
+      <w:rFonts w:cs="Mangal"/>
+      <w:i/>
+      <w:iCs/>
+      <w:color w:val="404040" w:themeColor="text1" w:themeTint="BF"/>
     </w:rPr>
   </w:style>
   <w:style w:type="paragraph" w:styleId="ListParagraph">
     <w:name w:val="List Paragraph"/>
     <w:basedOn w:val="Normal"/>
-    <w:uiPriority w:val="1"/>
-    <w:qFormat/>
-  </w:style>
-  <w:style w:type="paragraph" w:customStyle="1" w:styleId="TableParagraph">
-    <w:name w:val="Table Paragraph"/>
+    <w:uiPriority w:val="34"/>
+    <w:qFormat/>
+    <w:rsid w:val="00AC07C7"/>
+    <w:pPr>
+      <w:ind w:left="720"/>
+      <w:contextualSpacing/>
+    </w:pPr>
+  </w:style>
+  <w:style w:type="character" w:styleId="IntenseEmphasis">
+    <w:name w:val="Intense Emphasis"/>
+    <w:basedOn w:val="DefaultParagraphFont"/>
+    <w:uiPriority w:val="21"/>
+    <w:qFormat/>
+    <w:rsid w:val="00AC07C7"/>
+    <w:rPr>
+      <w:i/>
+      <w:iCs/>
+      <w:color w:val="2F5496" w:themeColor="accent1" w:themeShade="BF"/>
+    </w:rPr>
+  </w:style>
+  <w:style w:type="paragraph" w:styleId="IntenseQuote">
+    <w:name w:val="Intense Quote"/>
     <w:basedOn w:val="Normal"/>
-    <w:uiPriority w:val="1"/>
-    <w:qFormat/>
+    <w:next w:val="Normal"/>
+    <w:link w:val="IntenseQuoteChar"/>
+    <w:uiPriority w:val="30"/>
+    <w:qFormat/>
+    <w:rsid w:val="00AC07C7"/>
+    <w:pPr>
+      <w:pBdr>
+        <w:top w:val="single" w:sz="4" w:space="10" w:color="2F5496" w:themeColor="accent1" w:themeShade="BF"/>
+        <w:bottom w:val="single" w:sz="4" w:space="10" w:color="2F5496" w:themeColor="accent1" w:themeShade="BF"/>
+      </w:pBdr>
+      <w:spacing w:before="360" w:after="360"/>
+      <w:ind w:left="864" w:right="864"/>
+      <w:jc w:val="center"/>
+    </w:pPr>
+    <w:rPr>
+      <w:i/>
+      <w:iCs/>
+      <w:color w:val="2F5496" w:themeColor="accent1" w:themeShade="BF"/>
+    </w:rPr>
+  </w:style>
+  <w:style w:type="character" w:customStyle="1" w:styleId="IntenseQuoteChar">
+    <w:name w:val="Intense Quote Char"/>
+    <w:basedOn w:val="DefaultParagraphFont"/>
+    <w:link w:val="IntenseQuote"/>
+    <w:uiPriority w:val="30"/>
+    <w:rsid w:val="00AC07C7"/>
+    <w:rPr>
+      <w:rFonts w:cs="Mangal"/>
+      <w:i/>
+      <w:iCs/>
+      <w:color w:val="2F5496" w:themeColor="accent1" w:themeShade="BF"/>
+    </w:rPr>
+  </w:style>
+  <w:style w:type="character" w:styleId="IntenseReference">
+    <w:name w:val="Intense Reference"/>
+    <w:basedOn w:val="DefaultParagraphFont"/>
+    <w:uiPriority w:val="32"/>
+    <w:qFormat/>
+    <w:rsid w:val="00AC07C7"/>
+    <w:rPr>
+      <w:b/>
+      <w:bCs/>
+      <w:smallCaps/>
+      <w:color w:val="2F5496" w:themeColor="accent1" w:themeShade="BF"/>
+      <w:spacing w:val="5"/>
+    </w:rPr>
   </w:style>
 </w:styles>
 </file>
@@ -690,44 +1101,44 @@
         <a:sysClr val="window" lastClr="FFFFFF"/>
       </a:lt1>
       <a:dk2>
-        <a:srgbClr val="1F497D"/>
+        <a:srgbClr val="44546A"/>
       </a:dk2>
       <a:lt2>
-        <a:srgbClr val="EEECE1"/>
+        <a:srgbClr val="E7E6E6"/>
       </a:lt2>
       <a:accent1>
-        <a:srgbClr val="4F81BD"/>
+        <a:srgbClr val="4472C4"/>
       </a:accent1>
       <a:accent2>
-        <a:srgbClr val="C0504D"/>
+        <a:srgbClr val="ED7D31"/>
       </a:accent2>
       <a:accent3>
-        <a:srgbClr val="9BBB59"/>
+        <a:srgbClr val="A5A5A5"/>
       </a:accent3>
       <a:accent4>
-        <a:srgbClr val="8064A2"/>
+        <a:srgbClr val="FFC000"/>
       </a:accent4>
       <a:accent5>
-        <a:srgbClr val="4BACC6"/>
+        <a:srgbClr val="5B9BD5"/>
       </a:accent5>
       <a:accent6>
-        <a:srgbClr val="F79646"/>
+        <a:srgbClr val="70AD47"/>
       </a:accent6>
       <a:hlink>
-        <a:srgbClr val="0000FF"/>
+        <a:srgbClr val="0563C1"/>
       </a:hlink>
       <a:folHlink>
-        <a:srgbClr val="800080"/>
+        <a:srgbClr val="954F72"/>
       </a:folHlink>
     </a:clrScheme>
     <a:fontScheme name="Office">
       <a:majorFont>
-        <a:latin typeface="Cambria"/>
+        <a:latin typeface="Calibri Light" panose="020F0302020204030204"/>
         <a:ea typeface=""/>
         <a:cs typeface=""/>
-        <a:font script="Jpan" typeface="ＭＳ ゴシック"/>
+        <a:font script="Jpan" typeface="游ゴシック Light"/>
         <a:font script="Hang" typeface="맑은 고딕"/>
-        <a:font script="Hans" typeface="宋体"/>
+        <a:font script="Hans" typeface="等线 Light"/>
         <a:font script="Hant" typeface="新細明體"/>
         <a:font script="Arab" typeface="Times New Roman"/>
         <a:font script="Hebr" typeface="Times New Roman"/>
@@ -754,14 +1165,32 @@
         <a:font script="Mong" typeface="Mongolian Baiti"/>
         <a:font script="Viet" typeface="Times New Roman"/>
         <a:font script="Uigh" typeface="Microsoft Uighur"/>
+        <a:font script="Geor" typeface="Sylfaen"/>
+        <a:font script="Armn" typeface="Arial"/>
+        <a:font script="Bugi" typeface="Leelawadee UI"/>
+        <a:font script="Bopo" typeface="Microsoft JhengHei"/>
+        <a:font script="Java" typeface="Javanese Text"/>
+        <a:font script="Lisu" typeface="Segoe UI"/>
+        <a:font script="Mymr" typeface="Myanmar Text"/>
+        <a:font script="Nkoo" typeface="Ebrima"/>
+        <a:font script="Olck" typeface="Nirmala UI"/>
+        <a:font script="Osma" typeface="Ebrima"/>
+        <a:font script="Phag" typeface="Phagspa"/>
+        <a:font script="Syrn" typeface="Estrangelo Edessa"/>
+        <a:font script="Syrj" typeface="Estrangelo Edessa"/>
+        <a:font script="Syre" typeface="Estrangelo Edessa"/>
+        <a:font script="Sora" typeface="Nirmala UI"/>
+        <a:font script="Tale" typeface="Microsoft Tai Le"/>
+        <a:font script="Talu" typeface="Microsoft New Tai Lue"/>
+        <a:font script="Tfng" typeface="Ebrima"/>
       </a:majorFont>
       <a:minorFont>
-        <a:latin typeface="Calibri"/>
+        <a:latin typeface="Calibri" panose="020F0502020204030204"/>
         <a:ea typeface=""/>
         <a:cs typeface=""/>
-        <a:font script="Jpan" typeface="ＭＳ 明朝"/>
+        <a:font script="Jpan" typeface="游ゴシック"/>
         <a:font script="Hang" typeface="맑은 고딕"/>
-        <a:font script="Hans" typeface="宋体"/>
+        <a:font script="Hans" typeface="等线"/>
         <a:font script="Hant" typeface="新細明體"/>
         <a:font script="Arab" typeface="Arial"/>
         <a:font script="Hebr" typeface="Arial"/>
@@ -788,6 +1217,24 @@
         <a:font script="Mong" typeface="Mongolian Baiti"/>
         <a:font script="Viet" typeface="Arial"/>
         <a:font script="Uigh" typeface="Microsoft Uighur"/>
+        <a:font script="Geor" typeface="Sylfaen"/>
+        <a:font script="Armn" typeface="Arial"/>
+        <a:font script="Bugi" typeface="Leelawadee UI"/>
+        <a:font script="Bopo" typeface="Microsoft JhengHei"/>
+        <a:font script="Java" typeface="Javanese Text"/>
+        <a:font script="Lisu" typeface="Segoe UI"/>
+        <a:font script="Mymr" typeface="Myanmar Text"/>
+        <a:font script="Nkoo" typeface="Ebrima"/>
+        <a:font script="Olck" typeface="Nirmala UI"/>
+        <a:font script="Osma" typeface="Ebrima"/>
+        <a:font script="Phag" typeface="Phagspa"/>
+        <a:font script="Syrn" typeface="Estrangelo Edessa"/>
+        <a:font script="Syrj" typeface="Estrangelo Edessa"/>
+        <a:font script="Syre" typeface="Estrangelo Edessa"/>
+        <a:font script="Sora" typeface="Nirmala UI"/>
+        <a:font script="Tale" typeface="Microsoft Tai Le"/>
+        <a:font script="Talu" typeface="Microsoft New Tai Lue"/>
+        <a:font script="Tfng" typeface="Ebrima"/>
       </a:minorFont>
     </a:fontScheme>
     <a:fmtScheme name="Office">
@@ -799,165 +1246,141 @@
           <a:gsLst>
             <a:gs pos="0">
               <a:schemeClr val="phClr">
-                <a:tint val="50000"/>
-                <a:satMod val="300000"/>
+                <a:lumMod val="110000"/>
+                <a:satMod val="105000"/>
+                <a:tint val="67000"/>
               </a:schemeClr>
             </a:gs>
-            <a:gs pos="35000">
+            <a:gs pos="50000">
               <a:schemeClr val="phClr">
-                <a:tint val="37000"/>
-                <a:satMod val="300000"/>
+                <a:lumMod val="105000"/>
+                <a:satMod val="103000"/>
+                <a:tint val="73000"/>
               </a:schemeClr>
             </a:gs>
             <a:gs pos="100000">
               <a:schemeClr val="phClr">
-                <a:tint val="15000"/>
-                <a:satMod val="350000"/>
+                <a:lumMod val="105000"/>
+                <a:satMod val="109000"/>
+                <a:tint val="81000"/>
               </a:schemeClr>
             </a:gs>
           </a:gsLst>
-          <a:lin ang="16200000" scaled="1"/>
+          <a:lin ang="5400000" scaled="0"/>
         </a:gradFill>
         <a:gradFill rotWithShape="1">
           <a:gsLst>
             <a:gs pos="0">
               <a:schemeClr val="phClr">
-                <a:shade val="51000"/>
-                <a:satMod val="130000"/>
+                <a:satMod val="103000"/>
+                <a:lumMod val="102000"/>
+                <a:tint val="94000"/>
               </a:schemeClr>
             </a:gs>
-            <a:gs pos="80000">
+            <a:gs pos="50000">
               <a:schemeClr val="phClr">
-                <a:shade val="93000"/>
-                <a:satMod val="130000"/>
+                <a:satMod val="110000"/>
+                <a:lumMod val="100000"/>
+                <a:shade val="100000"/>
               </a:schemeClr>
             </a:gs>
             <a:gs pos="100000">
               <a:schemeClr val="phClr">
-                <a:shade val="94000"/>
-                <a:satMod val="135000"/>
+                <a:lumMod val="99000"/>
+                <a:satMod val="120000"/>
+                <a:shade val="78000"/>
               </a:schemeClr>
             </a:gs>
           </a:gsLst>
-          <a:lin ang="16200000" scaled="0"/>
+          <a:lin ang="5400000" scaled="0"/>
         </a:gradFill>
       </a:fillStyleLst>
       <a:lnStyleLst>
-        <a:ln w="9525" cap="flat" cmpd="sng" algn="ctr">
-          <a:solidFill>
-            <a:schemeClr val="phClr">
-              <a:shade val="95000"/>
-              <a:satMod val="105000"/>
-            </a:schemeClr>
-          </a:solidFill>
-          <a:prstDash val="solid"/>
-        </a:ln>
-        <a:ln w="25400" cap="flat" cmpd="sng" algn="ctr">
+        <a:ln w="6350" cap="flat" cmpd="sng" algn="ctr">
           <a:solidFill>
             <a:schemeClr val="phClr"/>
           </a:solidFill>
           <a:prstDash val="solid"/>
+          <a:miter lim="800000"/>
         </a:ln>
-        <a:ln w="38100" cap="flat" cmpd="sng" algn="ctr">
+        <a:ln w="12700" cap="flat" cmpd="sng" algn="ctr">
           <a:solidFill>
             <a:schemeClr val="phClr"/>
           </a:solidFill>
           <a:prstDash val="solid"/>
+          <a:miter lim="800000"/>
+        </a:ln>
+        <a:ln w="19050" cap="flat" cmpd="sng" algn="ctr">
+          <a:solidFill>
+            <a:schemeClr val="phClr"/>
+          </a:solidFill>
+          <a:prstDash val="solid"/>
+          <a:miter lim="800000"/>
         </a:ln>
       </a:lnStyleLst>
       <a:effectStyleLst>
         <a:effectStyle>
+          <a:effectLst/>
+        </a:effectStyle>
+        <a:effectStyle>
+          <a:effectLst/>
+        </a:effectStyle>
+        <a:effectStyle>
           <a:effectLst>
-            <a:outerShdw blurRad="40000" dist="20000" dir="5400000" rotWithShape="0">
+            <a:outerShdw blurRad="57150" dist="19050" dir="5400000" algn="ctr" rotWithShape="0">
               <a:srgbClr val="000000">
-                <a:alpha val="38000"/>
+                <a:alpha val="63000"/>
               </a:srgbClr>
             </a:outerShdw>
           </a:effectLst>
-        </a:effectStyle>
-        <a:effectStyle>
-          <a:effectLst>
-            <a:outerShdw blurRad="40000" dist="23000" dir="5400000" rotWithShape="0">
-              <a:srgbClr val="000000">
-                <a:alpha val="35000"/>
-              </a:srgbClr>
-            </a:outerShdw>
-          </a:effectLst>
-        </a:effectStyle>
-        <a:effectStyle>
-          <a:effectLst>
-            <a:outerShdw blurRad="40000" dist="23000" dir="5400000" rotWithShape="0">
-              <a:srgbClr val="000000">
-                <a:alpha val="35000"/>
-              </a:srgbClr>
-            </a:outerShdw>
-          </a:effectLst>
-          <a:scene3d>
-            <a:camera prst="orthographicFront">
-              <a:rot lat="0" lon="0" rev="0"/>
-            </a:camera>
-            <a:lightRig rig="threePt" dir="t">
-              <a:rot lat="0" lon="0" rev="1200000"/>
-            </a:lightRig>
-          </a:scene3d>
-          <a:sp3d>
-            <a:bevelT w="63500" h="25400"/>
-          </a:sp3d>
         </a:effectStyle>
       </a:effectStyleLst>
       <a:bgFillStyleLst>
         <a:solidFill>
           <a:schemeClr val="phClr"/>
         </a:solidFill>
+        <a:solidFill>
+          <a:schemeClr val="phClr">
+            <a:tint val="95000"/>
+            <a:satMod val="170000"/>
+          </a:schemeClr>
+        </a:solidFill>
         <a:gradFill rotWithShape="1">
           <a:gsLst>
             <a:gs pos="0">
               <a:schemeClr val="phClr">
-                <a:tint val="40000"/>
-                <a:satMod val="350000"/>
+                <a:tint val="93000"/>
+                <a:satMod val="150000"/>
+                <a:shade val="98000"/>
+                <a:lumMod val="102000"/>
               </a:schemeClr>
             </a:gs>
-            <a:gs pos="40000">
+            <a:gs pos="50000">
               <a:schemeClr val="phClr">
-                <a:tint val="45000"/>
-                <a:shade val="99000"/>
-                <a:satMod val="350000"/>
+                <a:tint val="98000"/>
+                <a:satMod val="130000"/>
+                <a:shade val="90000"/>
+                <a:lumMod val="103000"/>
               </a:schemeClr>
             </a:gs>
             <a:gs pos="100000">
               <a:schemeClr val="phClr">
-                <a:shade val="20000"/>
-                <a:satMod val="255000"/>
+                <a:shade val="63000"/>
+                <a:satMod val="120000"/>
               </a:schemeClr>
             </a:gs>
           </a:gsLst>
-          <a:path path="circle">
-            <a:fillToRect l="50000" t="-80000" r="50000" b="180000"/>
-          </a:path>
-        </a:gradFill>
-        <a:gradFill rotWithShape="1">
-          <a:gsLst>
-            <a:gs pos="0">
-              <a:schemeClr val="phClr">
-                <a:tint val="80000"/>
-                <a:satMod val="300000"/>
-              </a:schemeClr>
-            </a:gs>
-            <a:gs pos="100000">
-              <a:schemeClr val="phClr">
-                <a:shade val="30000"/>
-                <a:satMod val="200000"/>
-              </a:schemeClr>
-            </a:gs>
-          </a:gsLst>
-          <a:path path="circle">
-            <a:fillToRect l="50000" t="50000" r="50000" b="50000"/>
-          </a:path>
+          <a:lin ang="5400000" scaled="0"/>
         </a:gradFill>
       </a:bgFillStyleLst>
     </a:fmtScheme>
   </a:themeElements>
   <a:objectDefaults/>
   <a:extraClrSchemeLst/>
+  <a:extLst>
+    <a:ext uri="{05A4C25C-085E-4340-85A3-A5531E510DB2}">
+      <thm15:themeFamily xmlns:thm15="http://schemas.microsoft.com/office/thememl/2012/main" name="Office Theme" id="{62F939B6-93AF-4DB8-9C6B-D6C7DFDC589F}" vid="{4A3C46E8-61CC-4603-A589-7422A47A8E4A}"/>
+    </a:ext>
+  </a:extLst>
 </a:theme>
 </file>
</xml_diff>